<commit_message>
barlow: rescope O2 — generalization out, landscape-wide geomorphic change in
Per user (matches the project as discussed with the dissertation author):
focus = climate-driver attribution + geomorphological change broadly, not
detector expansion. All three variants + OSDMP + reference doc:
- O2 = whole-valley-floor change detection, classified by process type
  (channel shift, thermokarst, slope movement, fans, lake margins), each
  type tested against its own drivers (new H2: distinct driver fingerprints)
- lidar-REMA domain-shift correction demoted to supporting method ("sensor
  continuity"); cross-valley extension only where REMA quality allows
- new risk: outside-channel change below threshold -> calibrated null is
  itself a result; Yr-2 deliverable now the process-classification paper
Renders: formal/plain/basic 5 pp each, OSDMP 2 pp.

Co-Authored-By: Claude Fable 5 <noreply@anthropic.com>
</commit_message>
<xml_diff>
--- a/barlow/docs/finesst_osdmp.docx
+++ b/barlow/docs/finesst_osdmp.docx
@@ -989,7 +989,7 @@
                 <w:i w:val="0"/>
                 <w:sz w:val="18"/>
               </w:rPr>
-              <w:t>Stream-channel outlines detected by the retrained model (O2)</w:t>
+              <w:t>Stream-channel outlines + process-classified geomorphic-change maps (O2)</w:t>
             </w:r>
           </w:p>
         </w:tc>
@@ -1009,7 +1009,7 @@
                 <w:i w:val="0"/>
                 <w:sz w:val="18"/>
               </w:rPr>
-              <w:t>GeoPackage (OGC)</w:t>
+              <w:t>GeoPackage (OGC) / Cloud-Optimized GeoTIFF</w:t>
             </w:r>
           </w:p>
         </w:tc>

</xml_diff>

<commit_message>
barlow + docs: LiDAR casing repo-wide (44 docx, 25 PDFs re-rendered)
Co-Authored-By: Claude Fable 5 <noreply@anthropic.com>
</commit_message>
<xml_diff>
--- a/barlow/docs/finesst_osdmp.docx
+++ b/barlow/docs/finesst_osdmp.docx
@@ -167,7 +167,7 @@
                 <w:i w:val="0"/>
                 <w:sz w:val="18"/>
               </w:rPr>
-              <w:t>2001 airborne lidar DEM (NASA ATM, 2 m)</w:t>
+              <w:t>2001 airborne LiDAR DEM (NASA ATM, 2 m)</w:t>
             </w:r>
           </w:p>
         </w:tc>
@@ -229,7 +229,7 @@
                 <w:i w:val="0"/>
                 <w:sz w:val="18"/>
               </w:rPr>
-              <w:t>2014–15 airborne lidar DEM + point cloud (NCALM, 1 m)</w:t>
+              <w:t>2014–15 airborne LiDAR DEM + point cloud (NCALM, 1 m)</w:t>
             </w:r>
           </w:p>
         </w:tc>

</xml_diff>